<commit_message>
fix(spur-3d): refine flank contact imprint to razor-thin sliding thread line (0.0028*mn) with zero back-face bulge
</commit_message>
<xml_diff>
--- a/BAO_CAO_TINH_TOAN_UNG_SUAT_UON_BANH_RANG.docx
+++ b/BAO_CAO_TINH_TOAN_UNG_SUAT_UON_BANH_RANG.docx
@@ -815,12 +815,42 @@
             </w:tcMar>
           </w:tcPr>
           <w:p>
-            <w:r>
-              <w:rPr>
-                <w:sz w:val="19"/>
-              </w:rPr>
-              <w:t>Góc áp lực pháp tiêu chuẩn</w:t>
-            </w:r>
+            <w:proofErr w:type="spellStart"/>
+            <w:r>
+              <w:rPr>
+                <w:sz w:val="19"/>
+              </w:rPr>
+              <w:t>Góc</w:t>
+            </w:r>
+            <w:proofErr w:type="spellEnd"/>
+            <w:r>
+              <w:rPr>
+                <w:sz w:val="19"/>
+              </w:rPr>
+              <w:t xml:space="preserve"> </w:t>
+            </w:r>
+            <w:proofErr w:type="spellStart"/>
+            <w:r>
+              <w:rPr>
+                <w:sz w:val="19"/>
+              </w:rPr>
+              <w:t>ăn</w:t>
+            </w:r>
+            <w:proofErr w:type="spellEnd"/>
+            <w:r>
+              <w:rPr>
+                <w:sz w:val="19"/>
+              </w:rPr>
+              <w:t xml:space="preserve"> </w:t>
+            </w:r>
+            <w:proofErr w:type="spellStart"/>
+            <w:r>
+              <w:rPr>
+                <w:sz w:val="19"/>
+              </w:rPr>
+              <w:t>khớp</w:t>
+            </w:r>
+            <w:proofErr w:type="spellEnd"/>
           </w:p>
         </w:tc>
         <w:tc>
@@ -842,7 +872,7 @@
               <w:rPr>
                 <w:sz w:val="19"/>
               </w:rPr>
-              <w:t>αn</w:t>
+              <w:t>α</w:t>
             </w:r>
           </w:p>
         </w:tc>
@@ -2875,7 +2905,31 @@
         <w:t xml:space="preserve">• Hệ số vành răng rỗng: </w:t>
       </w:r>
       <w:r>
-        <w:t xml:space="preserve">Y_B = 1.000 (vành răng đặc, chiều dày vành </w:t>
+        <w:t xml:space="preserve">Y_B = 1.000 (vành răng đặc, </w:t>
+      </w:r>
+      <w:proofErr w:type="spellStart"/>
+      <w:r>
+        <w:t>chiều</w:t>
+      </w:r>
+      <w:proofErr w:type="spellEnd"/>
+      <w:r>
+        <w:t xml:space="preserve"> </w:t>
+      </w:r>
+      <w:proofErr w:type="spellStart"/>
+      <w:r>
+        <w:t>dày</w:t>
+      </w:r>
+      <w:proofErr w:type="spellEnd"/>
+      <w:r>
+        <w:t xml:space="preserve"> </w:t>
+      </w:r>
+      <w:proofErr w:type="spellStart"/>
+      <w:r>
+        <w:t>vành</w:t>
+      </w:r>
+      <w:proofErr w:type="spellEnd"/>
+      <w:r>
+        <w:t xml:space="preserve"> </w:t>
       </w:r>
       <w:proofErr w:type="spellStart"/>
       <w:r>
@@ -3697,11 +3751,19 @@
             </w:tcMar>
           </w:tcPr>
           <w:p>
-            <w:r>
-              <w:rPr>
-                <w:sz w:val="19"/>
-              </w:rPr>
-              <w:t xml:space="preserve">Bộ </w:t>
+            <w:proofErr w:type="spellStart"/>
+            <w:r>
+              <w:rPr>
+                <w:sz w:val="19"/>
+              </w:rPr>
+              <w:t>Bộ</w:t>
+            </w:r>
+            <w:proofErr w:type="spellEnd"/>
+            <w:r>
+              <w:rPr>
+                <w:sz w:val="19"/>
+              </w:rPr>
+              <w:t xml:space="preserve"> </w:t>
             </w:r>
             <w:proofErr w:type="spellStart"/>
             <w:r>
@@ -3863,7 +3925,31 @@
       </w:r>
       <w:proofErr w:type="spellEnd"/>
       <w:r>
-        <w:t xml:space="preserve"> tế tại chân răng được xác định theo công </w:t>
+        <w:t xml:space="preserve"> tế tại chân răng được xác </w:t>
+      </w:r>
+      <w:proofErr w:type="spellStart"/>
+      <w:r>
+        <w:t>định</w:t>
+      </w:r>
+      <w:proofErr w:type="spellEnd"/>
+      <w:r>
+        <w:t xml:space="preserve"> </w:t>
+      </w:r>
+      <w:proofErr w:type="spellStart"/>
+      <w:r>
+        <w:t>theo</w:t>
+      </w:r>
+      <w:proofErr w:type="spellEnd"/>
+      <w:r>
+        <w:t xml:space="preserve"> </w:t>
+      </w:r>
+      <w:proofErr w:type="spellStart"/>
+      <w:r>
+        <w:t>công</w:t>
+      </w:r>
+      <w:proofErr w:type="spellEnd"/>
+      <w:r>
+        <w:t xml:space="preserve"> </w:t>
       </w:r>
       <w:proofErr w:type="spellStart"/>
       <w:r>
@@ -3871,19 +3957,40 @@
       </w:r>
       <w:proofErr w:type="spellEnd"/>
       <w:r>
-        <w:t>: σF = σF0 * KF = σF0 * (KA * Kv * KFβ * KFα).</w:t>
+        <w:t xml:space="preserve">: </w:t>
+      </w:r>
+      <w:proofErr w:type="spellStart"/>
+      <w:r>
+        <w:t>σF</w:t>
+      </w:r>
+      <w:proofErr w:type="spellEnd"/>
+      <w:r>
+        <w:t xml:space="preserve"> = σF0 * KF = σF0 * (KA * Kv * KFβ * KFα).</w:t>
       </w:r>
       <w:r>
         <w:br/>
         <w:t xml:space="preserve">Với Kv = 1.001 (do vận tốc vòng rất thấp v = 0.52 m/s) và KFα = 1.000 (răng nghiêng mài chuẩn), bảng dưới đây tổng hợp kết quả tính toán ứng suất uốn cho cả 2 trường hợp lắp đặt thực </w:t>
       </w:r>
+      <w:proofErr w:type="spellStart"/>
       <w:proofErr w:type="gramStart"/>
       <w:r>
-        <w:t>tế :</w:t>
+        <w:t>tế</w:t>
+      </w:r>
+      <w:proofErr w:type="spellEnd"/>
+      <w:r>
+        <w:t xml:space="preserve"> :</w:t>
       </w:r>
       <w:proofErr w:type="gramEnd"/>
       <w:r>
-        <w:t xml:space="preserve"> Trường </w:t>
+        <w:t xml:space="preserve"> </w:t>
+      </w:r>
+      <w:proofErr w:type="spellStart"/>
+      <w:r>
+        <w:t>Trường</w:t>
+      </w:r>
+      <w:proofErr w:type="spellEnd"/>
+      <w:r>
+        <w:t xml:space="preserve"> </w:t>
       </w:r>
       <w:proofErr w:type="spellStart"/>
       <w:r>
@@ -3939,7 +4046,15 @@
       </w:r>
       <w:proofErr w:type="spellEnd"/>
       <w:r>
-        <w:t xml:space="preserve"> xứng (357 MPa) và Trường hợp dự phòng có độ lệch trục đàn hồi nhẹ (388 MPa):</w:t>
+        <w:t xml:space="preserve"> </w:t>
+      </w:r>
+      <w:proofErr w:type="spellStart"/>
+      <w:r>
+        <w:t>xứng</w:t>
+      </w:r>
+      <w:proofErr w:type="spellEnd"/>
+      <w:r>
+        <w:t xml:space="preserve"> (357 MPa) và Trường hợp dự phòng có độ lệch trục đàn hồi nhẹ (388 MPa):</w:t>
       </w:r>
     </w:p>
     <w:tbl>
@@ -4738,7 +4853,23 @@
           <w:b/>
           <w:color w:val="1E3A8A"/>
         </w:rPr>
-        <w:t xml:space="preserve"> chi tiết các thông số uốn của cả 2 bánh </w:t>
+        <w:t xml:space="preserve"> chi tiết các thông số uốn của </w:t>
+      </w:r>
+      <w:proofErr w:type="spellStart"/>
+      <w:r>
+        <w:rPr>
+          <w:b/>
+          <w:color w:val="1E3A8A"/>
+        </w:rPr>
+        <w:t>cả</w:t>
+      </w:r>
+      <w:proofErr w:type="spellEnd"/>
+      <w:r>
+        <w:rPr>
+          <w:b/>
+          <w:color w:val="1E3A8A"/>
+        </w:rPr>
+        <w:t xml:space="preserve"> 2 bánh </w:t>
       </w:r>
       <w:proofErr w:type="spellStart"/>
       <w:proofErr w:type="gramStart"/>
@@ -4799,13 +4930,59 @@
             <w:pPr>
               <w:jc w:val="center"/>
             </w:pPr>
+            <w:proofErr w:type="spellStart"/>
             <w:r>
               <w:rPr>
                 <w:b/>
                 <w:color w:val="FFFFFF"/>
                 <w:sz w:val="19"/>
               </w:rPr>
-              <w:t xml:space="preserve">Thông Số Kiểm </w:t>
+              <w:t>Thông</w:t>
+            </w:r>
+            <w:proofErr w:type="spellEnd"/>
+            <w:r>
+              <w:rPr>
+                <w:b/>
+                <w:color w:val="FFFFFF"/>
+                <w:sz w:val="19"/>
+              </w:rPr>
+              <w:t xml:space="preserve"> </w:t>
+            </w:r>
+            <w:proofErr w:type="spellStart"/>
+            <w:r>
+              <w:rPr>
+                <w:b/>
+                <w:color w:val="FFFFFF"/>
+                <w:sz w:val="19"/>
+              </w:rPr>
+              <w:t>Số</w:t>
+            </w:r>
+            <w:proofErr w:type="spellEnd"/>
+            <w:r>
+              <w:rPr>
+                <w:b/>
+                <w:color w:val="FFFFFF"/>
+                <w:sz w:val="19"/>
+              </w:rPr>
+              <w:t xml:space="preserve"> </w:t>
+            </w:r>
+            <w:proofErr w:type="spellStart"/>
+            <w:r>
+              <w:rPr>
+                <w:b/>
+                <w:color w:val="FFFFFF"/>
+                <w:sz w:val="19"/>
+              </w:rPr>
+              <w:t>Kiểm</w:t>
+            </w:r>
+            <w:proofErr w:type="spellEnd"/>
+            <w:r>
+              <w:rPr>
+                <w:b/>
+                <w:color w:val="FFFFFF"/>
+                <w:sz w:val="19"/>
+              </w:rPr>
+              <w:t xml:space="preserve"> </w:t>
             </w:r>
             <w:proofErr w:type="spellStart"/>
             <w:r>

</xml_diff>